<commit_message>
fix(lecons): lève la contradiction BIC/BNC de la leçon revenus passifs 05
- L'exercice 1 calculait la rentabilité d'un ebook au régime BNC
  (25,6 %, abattement 34 %) alors que la théorie classe ebooks et
  templates en BIC. L'énoncé annonce désormais son hypothèse et le
  corrigé se double d'une variante BIC services (21,2 %, abattement
  50 %) : 19,95 € nets par vente, 26 ventes mensuelles au lieu de 27.
  Taux 2026 vérifiés : 12,3 % BIC vente, 21,2 % BIC services,
  25,6 % BNC — seul le BNC a bougé au 1er janvier.
- Corrigé 1c : 878 € et 43,90 €/h (et non 879 € et 43,95 €/h).
- Deux des cinq points de la section « Transparence » sont levés dans
  le journal : taux BNC et seuils micro 2026-2028 confirmés.

Formulations d'origine conservées dans le journal des corrections.

Co-Authored-By: Claude Opus 5 <noreply@anthropic.com>
</commit_message>
<xml_diff>
--- a/livrables/lecons/2026-08-23_lecon-revenus-passifs_05_produits-numeriques-affiliation.docx
+++ b/livrables/lecons/2026-08-23_lecon-revenus-passifs_05_produits-numeriques-affiliation.docx
@@ -2405,7 +2405,7 @@
           <w:sz w:val="22"/>
           <w:szCs w:val="22"/>
         </w:rPr>
-        <w:t xml:space="preserve">Contexte : vous créez un ebook de 60 pages vendu 29 € sur la plateforme Gumroad (commission : 10 % du prix de vente).</w:t>
+        <w:t xml:space="preserve">Contexte : vous créez un ebook de 60 pages vendu 29 € sur la plateforme Gumroad (commission : 10 % du prix de vente). ⚠️ Hypothèse fiscale de l'exercice : la qualification d'un produit numérique téléchargeable est discutée — la section théorique le classe généralement en BIC, mais l'administration retient parfois le BNC selon la part de prestation intellectuelle. Le corrigé ci-dessous prend l'hypothèse BNC, la moins favorable, et donne ensuite la variante BIC prestations de services. La qualification réelle se tranche avec un comptable.</w:t>
       </w:r>
     </w:p>
     <w:p>
@@ -2515,7 +2515,7 @@
           <w:sz w:val="22"/>
           <w:szCs w:val="22"/>
         </w:rPr>
-        <w:t xml:space="preserve">Cotisations sociales (BNC 25,6 % sur CA) : 29 × 0,256 = 7,42 €</w:t>
+        <w:t xml:space="preserve">Cotisations sociales — hypothèse BNC à 25,6 % du CA : 29 × 0,256 = 7,42 € (taux 2026, en hausse depuis les 24,6 % de 2025)</w:t>
       </w:r>
     </w:p>
     <w:p>
@@ -2561,7 +2561,7 @@
           <w:sz w:val="22"/>
           <w:szCs w:val="22"/>
         </w:rPr>
-        <w:t xml:space="preserve">Base imposable IR (abattement 34 % micro-BNC) : 29 × 0,66 = 19,14 €</w:t>
+        <w:t xml:space="preserve">Base imposable IR — abattement de 34 % en micro-BNC : 29 × 0,66 = 19,14 €</w:t>
       </w:r>
     </w:p>
     <w:p>
@@ -2738,7 +2738,7 @@
           <w:sz w:val="22"/>
           <w:szCs w:val="22"/>
         </w:rPr>
-        <w:t xml:space="preserve">Corrigé 1c : Revenu sur 3 mois = 3 × 500 = 1 500 €. Heures investies = 15 + 5 = 20h. Taux horaire = 1 500 / 20 = 75 €/h. ⚠️ Cette valeur suppose que les 27 ventes/mois sont atteintes dès le mois 1, ce qui est rarement le cas. Avec une montée en charge réaliste (5, 15, 27 ventes sur 3 mois), le revenu réel sur 3 mois est (5 + 15 + 27) × 18,68 = 879 € → taux horaire effectif = 879 / 20 = 43,95 €/h.</w:t>
+        <w:t xml:space="preserve">Corrigé 1c : Revenu sur 3 mois = 3 × 500 = 1 500 €. Heures investies = 15 + 5 = 20h. Taux horaire = 1 500 / 20 = 75 €/h. ⚠️ Cette valeur suppose que les 27 ventes/mois sont atteintes dès le mois 1, ce qui est rarement le cas. Avec une montée en charge réaliste (5, 15, 27 ventes sur 3 mois), le revenu réel sur 3 mois est (5 + 15 + 27) × 18,68 = 878 € → taux horaire effectif = 878 / 20 = 43,90 €/h.</w:t>
       </w:r>
     </w:p>
     <w:p>
@@ -2756,7 +2756,39 @@
           <w:sz w:val="22"/>
           <w:szCs w:val="22"/>
         </w:rPr>
-        <w:t xml:space="preserve">Vérification de cohérence : le calcul est conforme à la théorie (section fiscalité) qui établit : cotisations = 25,6 % du CA brut et abattement IR = 34 %. Les deux chiffres sont appliqués séparément (les cotisations ne réduisent pas la base de l'abattement forfaitaire en régime micro).</w:t>
+        <w:t xml:space="preserve">Vérification de cohérence : les deux chiffres du corrigé — cotisations de 25,6 % du CA brut et abattement IR de 34 % — sont bien ceux du régime micro-BNC énoncés dans la section fiscalité, et ils s'appliquent séparément : les cotisations ne réduisent pas la base de l'abattement forfaitaire.</w:t>
+      </w:r>
+    </w:p>
+    <w:p>
+      <w:pPr>
+        <w:spacing w:after="80" w:before="80"/>
+      </w:pPr>
+      <w:r>
+        <w:rPr>
+          <w:rFonts w:ascii="Times New Roman" w:cs="Times New Roman" w:eastAsia="Times New Roman" w:hAnsi="Times New Roman"/>
+          <w:b w:val="false"/>
+          <w:bCs w:val="false"/>
+          <w:color w:val="1F2937"/>
+          <w:sz w:val="22"/>
+          <w:szCs w:val="22"/>
+        </w:rPr>
+        <w:t xml:space="preserve">Variante BIC prestations de services — ce que change la qualification. Taux de cotisations 2026 : 21,2 % au lieu de 25,6 %. Abattement forfaitaire IR : 50 % au lieu de 34 %. Le calcul devient : cotisations 29 × 0,212 = 6,15 € ; revenu net avant IR par vente 26,10 − 6,15 = 19,95 € ; il faut alors 500 / 19,95 ≈ 26 ventes par mois au lieu de 27, pour un CA brut de 754 € au lieu de 783 €. Sur l&amp;apos;impôt, la base imposable tombe à 14,50 € par vente (50 % de 29 €) au lieu de 19,14 €.</w:t>
+      </w:r>
+    </w:p>
+    <w:p>
+      <w:pPr>
+        <w:spacing w:after="80" w:before="80"/>
+      </w:pPr>
+      <w:r>
+        <w:rPr>
+          <w:rFonts w:ascii="Times New Roman" w:cs="Times New Roman" w:eastAsia="Times New Roman" w:hAnsi="Times New Roman"/>
+          <w:b w:val="false"/>
+          <w:bCs w:val="false"/>
+          <w:color w:val="1F2937"/>
+          <w:sz w:val="22"/>
+          <w:szCs w:val="22"/>
+        </w:rPr>
+        <w:t xml:space="preserve">Ce que ça t&amp;apos;apprend au-delà du résultat : la qualification fiscale n&amp;apos;est pas un détail administratif, c&amp;apos;est une variable du modèle économique. Entre BNC et BIC services, l&amp;apos;écart est ici de 4,4 points de cotisations et de 16 points d&amp;apos;abattement — et si l&amp;apos;activité relevait du BIC vente de marchandises (12,3 % de cotisations, 71 % d&amp;apos;abattement), l&amp;apos;écart serait bien plus grand encore. Avant de bâtir un plan de rentabilité, il faut savoir sous quel régime on se place.</w:t>
       </w:r>
     </w:p>
     <w:p>
@@ -3705,6 +3737,134 @@
           <w:szCs w:val="22"/>
         </w:rPr>
         <w:t xml:space="preserve">Ce que vous aborderez : la mécanique d'un portefeuille de dividendes, les ETF distribuants disponibles en France, le rendement locatif réel vs brut vs net, et la comparaison SCPI vs immobilier en direct.</w:t>
+      </w:r>
+    </w:p>
+    <w:p>
+      <w:pPr>
+        <w:spacing w:after="120" w:before="320"/>
+      </w:pPr>
+      <w:r>
+        <w:rPr>
+          <w:rFonts w:ascii="Times New Roman" w:cs="Times New Roman" w:eastAsia="Times New Roman" w:hAnsi="Times New Roman"/>
+          <w:b/>
+          <w:bCs/>
+          <w:color w:val="1B3A6B"/>
+          <w:sz w:val="30"/>
+          <w:szCs w:val="30"/>
+        </w:rPr>
+        <w:t xml:space="preserve">📝 Journal des corrections</w:t>
+      </w:r>
+    </w:p>
+    <w:p>
+      <w:pPr>
+        <w:spacing w:after="80" w:before="80"/>
+      </w:pPr>
+      <w:r>
+        <w:rPr>
+          <w:rFonts w:ascii="Times New Roman" w:cs="Times New Roman" w:eastAsia="Times New Roman" w:hAnsi="Times New Roman"/>
+          <w:b w:val="false"/>
+          <w:bCs w:val="false"/>
+          <w:color w:val="1F2937"/>
+          <w:sz w:val="22"/>
+          <w:szCs w:val="22"/>
+        </w:rPr>
+        <w:t xml:space="preserve">Leçon produite et relue le 23/08/2026. Les corrections sont fondues dans le texte ci-dessus ; les formulations d'origine sont conservées ici.</w:t>
+      </w:r>
+    </w:p>
+    <w:p>
+      <w:pPr>
+        <w:spacing w:after="80" w:before="80"/>
+      </w:pPr>
+      <w:r>
+        <w:rPr>
+          <w:rFonts w:ascii="Times New Roman" w:cs="Times New Roman" w:eastAsia="Times New Roman" w:hAnsi="Times New Roman"/>
+          <w:b w:val="false"/>
+          <w:bCs w:val="false"/>
+          <w:color w:val="1F2937"/>
+          <w:sz w:val="22"/>
+          <w:szCs w:val="22"/>
+        </w:rPr>
+        <w:t xml:space="preserve">1. Contradiction entre la théorie et l'exercice 1.</w:t>
+      </w:r>
+    </w:p>
+    <w:p>
+      <w:pPr>
+        <w:spacing w:after="80" w:before="80"/>
+      </w:pPr>
+      <w:r>
+        <w:rPr>
+          <w:rFonts w:ascii="Times New Roman" w:cs="Times New Roman" w:eastAsia="Times New Roman" w:hAnsi="Times New Roman"/>
+          <w:b w:val="false"/>
+          <w:bCs w:val="false"/>
+          <w:color w:val="1F2937"/>
+          <w:sz w:val="22"/>
+          <w:szCs w:val="22"/>
+        </w:rPr>
+        <w:t xml:space="preserve">La section théorique classe « la vente de produits numériques (ebooks, templates) » en BIC et réserve le BNC aux formations, au conseil et au coaching. L'exercice 1 calculait pourtant la rentabilité d'un EBOOK avec le taux BNC de 25,6 % et l'abattement micro-BNC de 34 %, sans signaler l'écart. Le choix n'est pas neutre : il commande les 18,68 € nets par vente sur lesquels repose tout le corrigé. L'énoncé indique désormais explicitement qu'il prend l'hypothèse BNC — la moins favorable — et le corrigé est complété d'une variante BIC prestations de services : 21,2 % de cotisations et 50 % d'abattement, soit 19,95 € nets par vente et 26 ventes mensuelles au lieu de 27. Taux 2026 vérifiés le 23/08/2026 : 12,3 % en BIC vente, 21,2 % en BIC services, 25,6 % en BNC — seul le taux BNC a bougé au 1er janvier 2026.</w:t>
+      </w:r>
+    </w:p>
+    <w:p>
+      <w:pPr>
+        <w:spacing w:after="80" w:before="80"/>
+      </w:pPr>
+      <w:r>
+        <w:rPr>
+          <w:rFonts w:ascii="Times New Roman" w:cs="Times New Roman" w:eastAsia="Times New Roman" w:hAnsi="Times New Roman"/>
+          <w:b w:val="false"/>
+          <w:bCs w:val="false"/>
+          <w:color w:val="1F2937"/>
+          <w:sz w:val="22"/>
+          <w:szCs w:val="22"/>
+        </w:rPr>
+        <w:t xml:space="preserve">2. Deux arrondis du corrigé 1c.</w:t>
+      </w:r>
+    </w:p>
+    <w:p>
+      <w:pPr>
+        <w:spacing w:after="80" w:before="80"/>
+      </w:pPr>
+      <w:r>
+        <w:rPr>
+          <w:rFonts w:ascii="Times New Roman" w:cs="Times New Roman" w:eastAsia="Times New Roman" w:hAnsi="Times New Roman"/>
+          <w:b w:val="false"/>
+          <w:bCs w:val="false"/>
+          <w:color w:val="1F2937"/>
+          <w:sz w:val="22"/>
+          <w:szCs w:val="22"/>
+        </w:rPr>
+        <w:t xml:space="preserve">Version initiale : « (5 + 15 + 27) × 18,68 = 879 € » et « 879 / 20 = 43,95 €/h ». Le produit exact est 877,96 €, soit 878 € et 43,90 €/h. L'ordre de grandeur — un taux horaire qui tombe de 75 € à 44 € dès qu'on suppose une montée en charge réaliste — est inchangé.</w:t>
+      </w:r>
+    </w:p>
+    <w:p>
+      <w:pPr>
+        <w:spacing w:after="80" w:before="80"/>
+      </w:pPr>
+      <w:r>
+        <w:rPr>
+          <w:rFonts w:ascii="Times New Roman" w:cs="Times New Roman" w:eastAsia="Times New Roman" w:hAnsi="Times New Roman"/>
+          <w:b w:val="false"/>
+          <w:bCs w:val="false"/>
+          <w:color w:val="1F2937"/>
+          <w:sz w:val="22"/>
+          <w:szCs w:val="22"/>
+        </w:rPr>
+        <w:t xml:space="preserve">3. Deux des cinq points de la section « Transparence » sont levés.</w:t>
+      </w:r>
+    </w:p>
+    <w:p>
+      <w:pPr>
+        <w:spacing w:after="80" w:before="80"/>
+      </w:pPr>
+      <w:r>
+        <w:rPr>
+          <w:rFonts w:ascii="Times New Roman" w:cs="Times New Roman" w:eastAsia="Times New Roman" w:hAnsi="Times New Roman"/>
+          <w:b w:val="false"/>
+          <w:bCs w:val="false"/>
+          <w:color w:val="1F2937"/>
+          <w:sz w:val="22"/>
+          <w:szCs w:val="22"/>
+        </w:rPr>
+        <w:t xml:space="preserve">La leçon signalait ne pas avoir pu vérifier ses données fiscales sur source primaire, urssaf.fr ayant refusé la connexion (ECONNRESET). La panne a été reproduite le 23/08/2026 : elle est réelle. La vérification a été faite ailleurs et confirme deux points. Les cotisations BNC sont bien à 25,6 % en 2026, contre 24,6 % en 2025 — la trajectoire prévoyait 26,1 %, finalement plafonnée à 25,6 %, et ce taux inclut la contribution à la formation professionnelle. Les seuils micro sont bien de 203 100 € (BIC vente) et 83 600 € (BIC services et BNC) pour la période 2026-2028, après une revalorisation de +7,6 %. Les abattements forfaitaires de 34 %, 50 % et 71 % sont les taux habituels, inchangés. Restent non vérifiables sur source primaire : les statistiques de revenus des affiliés et les tarifs des plateformes, tous deux issus de sources secondaires.</w:t>
       </w:r>
     </w:p>
     <w:sectPr>

</xml_diff>